<commit_message>
Updated HGT project management
</commit_message>
<xml_diff>
--- a/HGT-project-management.docx
+++ b/HGT-project-management.docx
@@ -317,735 +317,931 @@
         </w:rPr>
         <w:t>/dataset.</w:t>
       </w:r>
+    </w:p>
+    <w:p/>
+    <w:p>
+      <w:pPr>
+        <w:pStyle w:val="ListParagraph"/>
+        <w:numPr>
+          <w:ilvl w:val="0"/>
+          <w:numId w:val="2"/>
+        </w:numPr>
+      </w:pPr>
+      <w:proofErr w:type="spellStart"/>
+      <w:r>
+        <w:t>Zhuzhi</w:t>
+      </w:r>
+      <w:proofErr w:type="spellEnd"/>
+      <w:r>
+        <w:t xml:space="preserve"> – counting raw reads with flanking region, and reads of </w:t>
+      </w:r>
+      <w:proofErr w:type="spellStart"/>
+      <w:r>
+        <w:t>Blattabacterium</w:t>
+      </w:r>
+      <w:proofErr w:type="spellEnd"/>
+      <w:r>
+        <w:t xml:space="preserve"> origin</w:t>
+      </w:r>
+    </w:p>
+    <w:p>
+      <w:pPr>
+        <w:pStyle w:val="ListParagraph"/>
+        <w:numPr>
+          <w:ilvl w:val="1"/>
+          <w:numId w:val="2"/>
+        </w:numPr>
+        <w:rPr>
+          <w:highlight w:val="green"/>
+        </w:rPr>
+      </w:pPr>
+      <w:r>
+        <w:rPr>
+          <w:highlight w:val="green"/>
+        </w:rPr>
+        <w:t>Ongoing – looking how to share</w:t>
+      </w:r>
+    </w:p>
+    <w:p>
+      <w:pPr>
+        <w:pStyle w:val="ListParagraph"/>
+        <w:numPr>
+          <w:ilvl w:val="1"/>
+          <w:numId w:val="2"/>
+        </w:numPr>
+        <w:rPr>
+          <w:highlight w:val="cyan"/>
+        </w:rPr>
+      </w:pPr>
+      <w:r>
+        <w:rPr>
+          <w:highlight w:val="cyan"/>
+        </w:rPr>
+        <w:t xml:space="preserve">Looking at </w:t>
+      </w:r>
+      <w:proofErr w:type="spellStart"/>
+      <w:r>
+        <w:rPr>
+          <w:highlight w:val="cyan"/>
+        </w:rPr>
+        <w:t>Blatta</w:t>
+      </w:r>
+      <w:proofErr w:type="spellEnd"/>
+      <w:r>
+        <w:rPr>
+          <w:highlight w:val="cyan"/>
+        </w:rPr>
+        <w:t xml:space="preserve"> raw reads similarity vs cockroach raw read similarity</w:t>
+      </w:r>
+    </w:p>
+    <w:p>
+      <w:pPr>
+        <w:rPr>
+          <w:highlight w:val="cyan"/>
+        </w:rPr>
+      </w:pPr>
+    </w:p>
+    <w:p>
+      <w:pPr>
+        <w:pStyle w:val="ListParagraph"/>
+        <w:numPr>
+          <w:ilvl w:val="0"/>
+          <w:numId w:val="2"/>
+        </w:numPr>
+      </w:pPr>
+      <w:proofErr w:type="spellStart"/>
+      <w:r>
+        <w:t>Jil</w:t>
+      </w:r>
+      <w:proofErr w:type="spellEnd"/>
+      <w:r>
+        <w:t xml:space="preserve"> and Oscar </w:t>
+      </w:r>
+      <w:r>
+        <w:t>– looking at distance distribution between inserts</w:t>
+      </w:r>
+    </w:p>
+    <w:p>
+      <w:pPr>
+        <w:pStyle w:val="ListParagraph"/>
+        <w:numPr>
+          <w:ilvl w:val="1"/>
+          <w:numId w:val="2"/>
+        </w:numPr>
+        <w:rPr>
+          <w:highlight w:val="green"/>
+        </w:rPr>
+      </w:pPr>
+      <w:r>
+        <w:rPr>
+          <w:highlight w:val="green"/>
+        </w:rPr>
+        <w:t>Finished</w:t>
+      </w:r>
+    </w:p>
+    <w:p>
+      <w:pPr>
+        <w:pStyle w:val="ListParagraph"/>
+        <w:numPr>
+          <w:ilvl w:val="1"/>
+          <w:numId w:val="2"/>
+        </w:numPr>
+        <w:rPr>
+          <w:highlight w:val="green"/>
+        </w:rPr>
+      </w:pPr>
+      <w:r>
+        <w:rPr>
+          <w:highlight w:val="green"/>
+        </w:rPr>
+        <w:t>Spreadsheet made with genomes/gaps</w:t>
+      </w:r>
+    </w:p>
+    <w:p>
+      <w:pPr>
+        <w:pStyle w:val="ListParagraph"/>
+        <w:numPr>
+          <w:ilvl w:val="1"/>
+          <w:numId w:val="2"/>
+        </w:numPr>
+        <w:rPr>
+          <w:highlight w:val="cyan"/>
+        </w:rPr>
+      </w:pPr>
+      <w:r>
+        <w:rPr>
+          <w:highlight w:val="cyan"/>
+        </w:rPr>
+        <w:t>Need to map distribution</w:t>
+      </w:r>
+      <w:r>
+        <w:rPr>
+          <w:highlight w:val="cyan"/>
+        </w:rPr>
+        <w:t xml:space="preserve"> – overall distribution (bell curve) and possibly alternative colouring for different contigs.</w:t>
+      </w:r>
+      <w:r>
+        <w:rPr>
+          <w:highlight w:val="cyan"/>
+        </w:rPr>
+        <w:t xml:space="preserve"> Is it random?</w:t>
+      </w:r>
+    </w:p>
+    <w:p>
+      <w:pPr>
+        <w:pStyle w:val="ListParagraph"/>
+        <w:numPr>
+          <w:ilvl w:val="1"/>
+          <w:numId w:val="2"/>
+        </w:numPr>
+        <w:rPr>
+          <w:highlight w:val="cyan"/>
+        </w:rPr>
+      </w:pPr>
+      <w:r>
+        <w:rPr>
+          <w:highlight w:val="cyan"/>
+        </w:rPr>
+        <w:t>Work on Figures (start with figure with counts of inserts</w:t>
+      </w:r>
+    </w:p>
+    <w:p>
+      <w:pPr>
+        <w:rPr>
+          <w:highlight w:val="cyan"/>
+        </w:rPr>
+      </w:pPr>
+    </w:p>
+    <w:p>
+      <w:pPr>
+        <w:pStyle w:val="ListParagraph"/>
+        <w:numPr>
+          <w:ilvl w:val="0"/>
+          <w:numId w:val="2"/>
+        </w:numPr>
+      </w:pPr>
+      <w:r>
+        <w:t>Maxim – annotating inserts</w:t>
+      </w:r>
+    </w:p>
+    <w:p>
+      <w:pPr>
+        <w:pStyle w:val="ListParagraph"/>
+        <w:numPr>
+          <w:ilvl w:val="1"/>
+          <w:numId w:val="2"/>
+        </w:numPr>
+        <w:rPr>
+          <w:highlight w:val="green"/>
+        </w:rPr>
+      </w:pPr>
+      <w:r>
+        <w:rPr>
+          <w:highlight w:val="green"/>
+        </w:rPr>
+        <w:t>Mostly intergenic, within genes it was mostly intronic</w:t>
+      </w:r>
+    </w:p>
+    <w:p>
+      <w:pPr>
+        <w:pStyle w:val="ListParagraph"/>
+        <w:numPr>
+          <w:ilvl w:val="2"/>
+          <w:numId w:val="2"/>
+        </w:numPr>
+        <w:rPr>
+          <w:highlight w:val="green"/>
+        </w:rPr>
+      </w:pPr>
+      <w:r>
+        <w:rPr>
+          <w:highlight w:val="green"/>
+        </w:rPr>
+        <w:t>With the caveat that we are using a coarse annotation method</w:t>
+      </w:r>
+    </w:p>
+    <w:p>
+      <w:pPr>
+        <w:pStyle w:val="ListParagraph"/>
+        <w:numPr>
+          <w:ilvl w:val="1"/>
+          <w:numId w:val="2"/>
+        </w:numPr>
+        <w:rPr>
+          <w:highlight w:val="cyan"/>
+        </w:rPr>
+      </w:pPr>
+      <w:r>
+        <w:rPr>
+          <w:highlight w:val="cyan"/>
+        </w:rPr>
+        <w:t>Compare this to proportion of features in genome</w:t>
+      </w:r>
+    </w:p>
+    <w:p>
+      <w:pPr>
+        <w:pStyle w:val="ListParagraph"/>
+        <w:numPr>
+          <w:ilvl w:val="1"/>
+          <w:numId w:val="2"/>
+        </w:numPr>
+        <w:rPr>
+          <w:highlight w:val="cyan"/>
+        </w:rPr>
+      </w:pPr>
+      <w:r>
+        <w:rPr>
+          <w:highlight w:val="cyan"/>
+        </w:rPr>
+        <w:t>Looking at some exons</w:t>
+      </w:r>
+    </w:p>
+    <w:p>
+      <w:pPr>
+        <w:rPr>
+          <w:highlight w:val="cyan"/>
+        </w:rPr>
+      </w:pPr>
+    </w:p>
+    <w:p>
+      <w:pPr>
+        <w:pStyle w:val="ListParagraph"/>
+        <w:numPr>
+          <w:ilvl w:val="0"/>
+          <w:numId w:val="2"/>
+        </w:numPr>
+      </w:pPr>
+      <w:r>
+        <w:t>Nate – PCRs</w:t>
+      </w:r>
+    </w:p>
+    <w:p>
+      <w:pPr>
+        <w:pStyle w:val="ListParagraph"/>
+        <w:numPr>
+          <w:ilvl w:val="1"/>
+          <w:numId w:val="2"/>
+        </w:numPr>
+        <w:rPr>
+          <w:highlight w:val="cyan"/>
+        </w:rPr>
+      </w:pPr>
+      <w:r>
+        <w:rPr>
+          <w:highlight w:val="cyan"/>
+        </w:rPr>
+        <w:t>Waiting on the ageing</w:t>
+      </w:r>
+    </w:p>
+    <w:p>
+      <w:pPr>
+        <w:rPr>
+          <w:highlight w:val="cyan"/>
+        </w:rPr>
+      </w:pPr>
+    </w:p>
+    <w:p>
+      <w:pPr>
+        <w:pStyle w:val="ListParagraph"/>
+        <w:numPr>
+          <w:ilvl w:val="0"/>
+          <w:numId w:val="2"/>
+        </w:numPr>
+      </w:pPr>
+      <w:r>
+        <w:t xml:space="preserve">Nate and Kyle </w:t>
+      </w:r>
+      <w:r>
+        <w:t>–</w:t>
+      </w:r>
+      <w:r>
+        <w:t xml:space="preserve"> manuscript</w:t>
+      </w:r>
+    </w:p>
+    <w:p>
+      <w:pPr>
+        <w:pStyle w:val="ListParagraph"/>
+        <w:numPr>
+          <w:ilvl w:val="1"/>
+          <w:numId w:val="2"/>
+        </w:numPr>
+        <w:rPr>
+          <w:highlight w:val="cyan"/>
+        </w:rPr>
+      </w:pPr>
+      <w:r>
+        <w:rPr>
+          <w:highlight w:val="cyan"/>
+        </w:rPr>
+        <w:t>Selling points:</w:t>
+      </w:r>
+    </w:p>
+    <w:p>
+      <w:pPr>
+        <w:pStyle w:val="ListParagraph"/>
+        <w:numPr>
+          <w:ilvl w:val="2"/>
+          <w:numId w:val="2"/>
+        </w:numPr>
+        <w:rPr>
+          <w:highlight w:val="cyan"/>
+        </w:rPr>
+      </w:pPr>
+      <w:r>
+        <w:rPr>
+          <w:highlight w:val="cyan"/>
+        </w:rPr>
+        <w:t>There are lots of them</w:t>
+      </w:r>
+    </w:p>
+    <w:p>
+      <w:pPr>
+        <w:pStyle w:val="ListParagraph"/>
+        <w:numPr>
+          <w:ilvl w:val="2"/>
+          <w:numId w:val="2"/>
+        </w:numPr>
+        <w:rPr>
+          <w:highlight w:val="cyan"/>
+        </w:rPr>
+      </w:pPr>
+      <w:r>
+        <w:rPr>
+          <w:highlight w:val="cyan"/>
+        </w:rPr>
+        <w:t>Many are very old</w:t>
+      </w:r>
+    </w:p>
+    <w:p>
+      <w:pPr>
+        <w:pStyle w:val="ListParagraph"/>
+        <w:numPr>
+          <w:ilvl w:val="2"/>
+          <w:numId w:val="2"/>
+        </w:numPr>
+        <w:rPr>
+          <w:highlight w:val="cyan"/>
+        </w:rPr>
+      </w:pPr>
+      <w:r>
+        <w:rPr>
+          <w:highlight w:val="cyan"/>
+        </w:rPr>
+        <w:t>Found in termites</w:t>
+      </w:r>
+    </w:p>
+    <w:p>
+      <w:pPr>
+        <w:pStyle w:val="ListParagraph"/>
+        <w:numPr>
+          <w:ilvl w:val="1"/>
+          <w:numId w:val="2"/>
+        </w:numPr>
+        <w:rPr>
+          <w:highlight w:val="cyan"/>
+        </w:rPr>
+      </w:pPr>
+      <w:r>
+        <w:rPr>
+          <w:highlight w:val="cyan"/>
+        </w:rPr>
+        <w:t>Figures:</w:t>
+      </w:r>
+    </w:p>
+    <w:p>
+      <w:pPr>
+        <w:pStyle w:val="ListParagraph"/>
+        <w:numPr>
+          <w:ilvl w:val="2"/>
+          <w:numId w:val="2"/>
+        </w:numPr>
+        <w:rPr>
+          <w:highlight w:val="cyan"/>
+        </w:rPr>
+      </w:pPr>
+      <w:r>
+        <w:rPr>
+          <w:highlight w:val="cyan"/>
+        </w:rPr>
+        <w:t>Counts of inserts for each genome</w:t>
+      </w:r>
+    </w:p>
+    <w:p>
+      <w:pPr>
+        <w:pStyle w:val="ListParagraph"/>
+        <w:numPr>
+          <w:ilvl w:val="3"/>
+          <w:numId w:val="2"/>
+        </w:numPr>
+        <w:rPr>
+          <w:highlight w:val="cyan"/>
+        </w:rPr>
+      </w:pPr>
+      <w:r>
+        <w:rPr>
+          <w:highlight w:val="cyan"/>
+        </w:rPr>
+        <w:t>within a tree</w:t>
+      </w:r>
+    </w:p>
+    <w:p>
+      <w:pPr>
+        <w:pStyle w:val="ListParagraph"/>
+        <w:numPr>
+          <w:ilvl w:val="3"/>
+          <w:numId w:val="2"/>
+        </w:numPr>
+        <w:rPr>
+          <w:highlight w:val="cyan"/>
+        </w:rPr>
+      </w:pPr>
+      <w:r>
+        <w:rPr>
+          <w:highlight w:val="cyan"/>
+        </w:rPr>
+        <w:t>add columns for tips</w:t>
+      </w:r>
+    </w:p>
+    <w:p>
+      <w:pPr>
+        <w:pStyle w:val="ListParagraph"/>
+        <w:numPr>
+          <w:ilvl w:val="3"/>
+          <w:numId w:val="2"/>
+        </w:numPr>
+        <w:rPr>
+          <w:highlight w:val="cyan"/>
+        </w:rPr>
+      </w:pPr>
+      <w:r>
+        <w:rPr>
+          <w:highlight w:val="cyan"/>
+        </w:rPr>
+        <w:lastRenderedPageBreak/>
+        <w:t>distance distribution</w:t>
+      </w:r>
+    </w:p>
+    <w:p>
+      <w:pPr>
+        <w:pStyle w:val="ListParagraph"/>
+        <w:numPr>
+          <w:ilvl w:val="2"/>
+          <w:numId w:val="2"/>
+        </w:numPr>
+        <w:rPr>
+          <w:highlight w:val="cyan"/>
+        </w:rPr>
+      </w:pPr>
+      <w:r>
+        <w:rPr>
+          <w:highlight w:val="cyan"/>
+        </w:rPr>
+        <w:t>Annotation results</w:t>
+      </w:r>
+    </w:p>
+    <w:p>
+      <w:pPr>
+        <w:pStyle w:val="ListParagraph"/>
+        <w:numPr>
+          <w:ilvl w:val="3"/>
+          <w:numId w:val="2"/>
+        </w:numPr>
+        <w:rPr>
+          <w:highlight w:val="cyan"/>
+        </w:rPr>
+      </w:pPr>
+      <w:r>
+        <w:rPr>
+          <w:highlight w:val="cyan"/>
+        </w:rPr>
+        <w:t>e.g. pie graph of proportion of inserts in each genome vs expected (based % of total features)</w:t>
+      </w:r>
+    </w:p>
+    <w:p>
+      <w:pPr>
+        <w:pStyle w:val="ListParagraph"/>
+        <w:numPr>
+          <w:ilvl w:val="2"/>
+          <w:numId w:val="2"/>
+        </w:numPr>
+        <w:rPr>
+          <w:highlight w:val="cyan"/>
+        </w:rPr>
+      </w:pPr>
+      <w:r>
+        <w:rPr>
+          <w:highlight w:val="cyan"/>
+        </w:rPr>
+        <w:t>Ageing:</w:t>
+      </w:r>
+    </w:p>
+    <w:p>
+      <w:pPr>
+        <w:pStyle w:val="ListParagraph"/>
+        <w:numPr>
+          <w:ilvl w:val="3"/>
+          <w:numId w:val="2"/>
+        </w:numPr>
+        <w:rPr>
+          <w:highlight w:val="cyan"/>
+        </w:rPr>
+      </w:pPr>
+      <w:r>
+        <w:rPr>
+          <w:highlight w:val="cyan"/>
+        </w:rPr>
+        <w:t>Number of ancestral vs recent</w:t>
+      </w:r>
+    </w:p>
+    <w:p>
+      <w:pPr>
+        <w:pStyle w:val="ListParagraph"/>
+        <w:numPr>
+          <w:ilvl w:val="3"/>
+          <w:numId w:val="2"/>
+        </w:numPr>
+        <w:rPr>
+          <w:highlight w:val="cyan"/>
+        </w:rPr>
+      </w:pPr>
+      <w:r>
+        <w:rPr>
+          <w:highlight w:val="cyan"/>
+        </w:rPr>
+        <w:t>Of the ancestral, minimum ages</w:t>
+      </w:r>
+    </w:p>
+    <w:p>
+      <w:pPr>
+        <w:pStyle w:val="ListParagraph"/>
+        <w:numPr>
+          <w:ilvl w:val="2"/>
+          <w:numId w:val="2"/>
+        </w:numPr>
+        <w:rPr>
+          <w:highlight w:val="cyan"/>
+        </w:rPr>
+      </w:pPr>
+      <w:r>
+        <w:rPr>
+          <w:highlight w:val="cyan"/>
+        </w:rPr>
+        <w:t>Picture of alignment of raw read over insert</w:t>
+      </w:r>
+    </w:p>
+    <w:p/>
+    <w:p>
+      <w:pPr>
+        <w:pStyle w:val="ListParagraph"/>
+        <w:numPr>
+          <w:ilvl w:val="0"/>
+          <w:numId w:val="2"/>
+        </w:numPr>
+      </w:pPr>
+      <w:r>
+        <w:t>Other things to consider:</w:t>
+      </w:r>
+    </w:p>
+    <w:p>
+      <w:pPr>
+        <w:pStyle w:val="ListParagraph"/>
+        <w:numPr>
+          <w:ilvl w:val="1"/>
+          <w:numId w:val="2"/>
+        </w:numPr>
+      </w:pPr>
+      <w:r>
+        <w:t>look at insert lengths for ancestral vs recent</w:t>
+      </w:r>
+    </w:p>
+    <w:p>
+      <w:pPr>
+        <w:pStyle w:val="ListParagraph"/>
+        <w:numPr>
+          <w:ilvl w:val="1"/>
+          <w:numId w:val="2"/>
+        </w:numPr>
+      </w:pPr>
+      <w:r>
+        <w:t>alternative thresholds and repeating pipeline</w:t>
+      </w:r>
+    </w:p>
+    <w:p>
+      <w:pPr>
+        <w:pStyle w:val="ListParagraph"/>
+        <w:numPr>
+          <w:ilvl w:val="1"/>
+          <w:numId w:val="2"/>
+        </w:numPr>
+      </w:pPr>
+      <w:r>
+        <w:t xml:space="preserve">Looking at inserts with </w:t>
+      </w:r>
+      <w:proofErr w:type="spellStart"/>
+      <w:r>
+        <w:t>RNAseq</w:t>
+      </w:r>
+      <w:proofErr w:type="spellEnd"/>
+      <w:r>
+        <w:t xml:space="preserve"> data (we have this for at least 2 species</w:t>
+      </w:r>
+    </w:p>
+    <w:p>
+      <w:pPr>
+        <w:pStyle w:val="ListParagraph"/>
+        <w:numPr>
+          <w:ilvl w:val="1"/>
+          <w:numId w:val="2"/>
+        </w:numPr>
+      </w:pPr>
+      <w:r>
+        <w:t>SNP distribution – are the flanking regions conserved?</w:t>
+      </w:r>
+    </w:p>
+    <w:p>
+      <w:pPr>
+        <w:pStyle w:val="ListParagraph"/>
+        <w:numPr>
+          <w:ilvl w:val="1"/>
+          <w:numId w:val="2"/>
+        </w:numPr>
+      </w:pPr>
+      <w:r>
+        <w:t>looking at distance from transposons and distance from repeat regions</w:t>
+      </w:r>
+    </w:p>
+    <w:p>
+      <w:pPr>
+        <w:pStyle w:val="ListParagraph"/>
+        <w:numPr>
+          <w:ilvl w:val="1"/>
+          <w:numId w:val="2"/>
+        </w:numPr>
+      </w:pPr>
+      <w:r>
+        <w:t>GC content of inserts (e.g. regulatory regions)</w:t>
+      </w:r>
+    </w:p>
+    <w:p>
+      <w:pPr>
+        <w:pStyle w:val="ListParagraph"/>
+        <w:numPr>
+          <w:ilvl w:val="1"/>
+          <w:numId w:val="2"/>
+        </w:numPr>
+      </w:pPr>
+      <w:r>
+        <w:t xml:space="preserve">what parts of the </w:t>
+      </w:r>
+      <w:proofErr w:type="spellStart"/>
+      <w:r>
+        <w:t>Blattabacterium</w:t>
+      </w:r>
+      <w:proofErr w:type="spellEnd"/>
+      <w:r>
+        <w:t xml:space="preserve"> genome are getting inserting – is it random</w:t>
+      </w:r>
+    </w:p>
+    <w:p/>
+    <w:p/>
+    <w:p>
+      <w:pPr>
+        <w:rPr>
+          <w:b/>
+          <w:bCs/>
+          <w:i/>
+          <w:iCs/>
+        </w:rPr>
+      </w:pPr>
+      <w:r>
+        <w:rPr>
+          <w:b/>
+          <w:bCs/>
+          <w:i/>
+          <w:iCs/>
+        </w:rPr>
+        <w:t>Updated analysis to do:</w:t>
+      </w:r>
+    </w:p>
+    <w:p>
+      <w:r>
+        <w:t>Old vs new inserts = Kyle</w:t>
+      </w:r>
+    </w:p>
+    <w:p>
+      <w:pPr>
+        <w:pStyle w:val="ListParagraph"/>
+        <w:numPr>
+          <w:ilvl w:val="0"/>
+          <w:numId w:val="8"/>
+        </w:numPr>
+      </w:pPr>
+      <w:r>
+        <w:t>Noting that some may be independent insertions in different species</w:t>
+      </w:r>
+    </w:p>
+    <w:p>
+      <w:pPr>
+        <w:pStyle w:val="ListParagraph"/>
+        <w:numPr>
+          <w:ilvl w:val="0"/>
+          <w:numId w:val="8"/>
+        </w:numPr>
+      </w:pPr>
+      <w:r>
+        <w:t xml:space="preserve">i.e. not all putative old are ancestral - but they are old, as they've diverged enough to be closer to one another than to the </w:t>
+      </w:r>
+      <w:proofErr w:type="spellStart"/>
+      <w:r>
+        <w:t>Blattabacterium</w:t>
+      </w:r>
+      <w:proofErr w:type="spellEnd"/>
+    </w:p>
+    <w:p/>
+    <w:p>
+      <w:r>
+        <w:t>Estimating age based on tree = Jack Marsden</w:t>
+      </w:r>
+    </w:p>
+    <w:p>
+      <w:pPr>
+        <w:pStyle w:val="ListParagraph"/>
+        <w:numPr>
+          <w:ilvl w:val="0"/>
+          <w:numId w:val="7"/>
+        </w:numPr>
+      </w:pPr>
+      <w:r>
+        <w:t>Considering the above point</w:t>
+      </w:r>
+    </w:p>
+    <w:p/>
+    <w:p>
+      <w:r>
+        <w:t>Annotating inserts = Maxim</w:t>
+      </w:r>
+    </w:p>
+    <w:p>
+      <w:pPr>
+        <w:pStyle w:val="ListParagraph"/>
+        <w:numPr>
+          <w:ilvl w:val="0"/>
+          <w:numId w:val="6"/>
+        </w:numPr>
+      </w:pPr>
+      <w:r>
+        <w:t>Assessing intergenic vs genic</w:t>
+      </w:r>
+    </w:p>
+    <w:p>
+      <w:pPr>
+        <w:pStyle w:val="ListParagraph"/>
+        <w:numPr>
+          <w:ilvl w:val="0"/>
+          <w:numId w:val="6"/>
+        </w:numPr>
+      </w:pPr>
+      <w:r>
+        <w:t>Comparing to expectations</w:t>
+      </w:r>
+    </w:p>
+    <w:p>
+      <w:pPr>
+        <w:pStyle w:val="ListParagraph"/>
+        <w:numPr>
+          <w:ilvl w:val="0"/>
+          <w:numId w:val="6"/>
+        </w:numPr>
+      </w:pPr>
+      <w:r>
+        <w:t>Comparing old vs new</w:t>
+      </w:r>
+    </w:p>
+    <w:p/>
+    <w:p>
+      <w:r>
+        <w:t xml:space="preserve">Assessing inserts within raw reads = </w:t>
+      </w:r>
+      <w:proofErr w:type="spellStart"/>
+      <w:r>
+        <w:t>Zhuzhi</w:t>
+      </w:r>
+      <w:proofErr w:type="spellEnd"/>
+    </w:p>
+    <w:p>
+      <w:pPr>
+        <w:pStyle w:val="ListParagraph"/>
+        <w:numPr>
+          <w:ilvl w:val="0"/>
+          <w:numId w:val="5"/>
+        </w:numPr>
+      </w:pPr>
+      <w:r>
+        <w:t>Do for 2-3 species</w:t>
+      </w:r>
+    </w:p>
+    <w:p/>
+    <w:p>
+      <w:r>
+        <w:t>D</w:t>
+      </w:r>
+      <w:r>
+        <w:t>istance distribution between inserts</w:t>
+      </w:r>
+      <w:r>
+        <w:t xml:space="preserve"> = Jill and Oscar / Maxim</w:t>
+      </w:r>
+    </w:p>
+    <w:p/>
+    <w:p>
+      <w:r>
+        <w:t>Length distribution of inserts = Jill and Oscar / Maxim</w:t>
+      </w:r>
+    </w:p>
+    <w:p/>
+    <w:p>
+      <w:r>
+        <w:t xml:space="preserve">Checking and assessing some putatively old inserts = </w:t>
+      </w:r>
+      <w:proofErr w:type="spellStart"/>
+      <w:r>
+        <w:t>Zhuzhi</w:t>
+      </w:r>
+      <w:proofErr w:type="spellEnd"/>
+    </w:p>
+    <w:p/>
+    <w:p>
+      <w:r>
+        <w:t>GC content of inserts vs non-inserts = Leo</w:t>
+      </w:r>
+    </w:p>
+    <w:p/>
+    <w:p>
+      <w:r>
+        <w:t xml:space="preserve">Insert origin within </w:t>
+      </w:r>
+      <w:proofErr w:type="spellStart"/>
+      <w:r>
+        <w:t>Blattabacterium</w:t>
+      </w:r>
+      <w:proofErr w:type="spellEnd"/>
+      <w:r>
+        <w:t xml:space="preserve"> = Leo</w:t>
+      </w:r>
+    </w:p>
+    <w:p/>
+    <w:p>
+      <w:r>
+        <w:t xml:space="preserve">PCRs </w:t>
+      </w:r>
+      <w:proofErr w:type="gramStart"/>
+      <w:r>
+        <w:t>= ?</w:t>
+      </w:r>
       <w:bookmarkStart w:id="0" w:name="_GoBack"/>
       <w:bookmarkEnd w:id="0"/>
-    </w:p>
-    <w:p/>
-    <w:p>
-      <w:pPr>
-        <w:pStyle w:val="ListParagraph"/>
-        <w:numPr>
-          <w:ilvl w:val="0"/>
-          <w:numId w:val="2"/>
-        </w:numPr>
-      </w:pPr>
-      <w:proofErr w:type="spellStart"/>
-      <w:r>
-        <w:t>Zhuzhi</w:t>
-      </w:r>
-      <w:proofErr w:type="spellEnd"/>
-      <w:r>
-        <w:t xml:space="preserve"> – counting raw reads with flanking region, and reads of </w:t>
-      </w:r>
-      <w:proofErr w:type="spellStart"/>
-      <w:r>
-        <w:t>Blattabacterium</w:t>
-      </w:r>
-      <w:proofErr w:type="spellEnd"/>
-      <w:r>
-        <w:t xml:space="preserve"> origin</w:t>
-      </w:r>
-    </w:p>
-    <w:p>
-      <w:pPr>
-        <w:pStyle w:val="ListParagraph"/>
-        <w:numPr>
-          <w:ilvl w:val="1"/>
-          <w:numId w:val="2"/>
-        </w:numPr>
-        <w:rPr>
-          <w:highlight w:val="green"/>
-        </w:rPr>
-      </w:pPr>
-      <w:r>
-        <w:rPr>
-          <w:highlight w:val="green"/>
-        </w:rPr>
-        <w:t>Ongoing – looking how to share</w:t>
-      </w:r>
-    </w:p>
-    <w:p>
-      <w:pPr>
-        <w:pStyle w:val="ListParagraph"/>
-        <w:numPr>
-          <w:ilvl w:val="1"/>
-          <w:numId w:val="2"/>
-        </w:numPr>
-        <w:rPr>
-          <w:highlight w:val="cyan"/>
-        </w:rPr>
-      </w:pPr>
-      <w:r>
-        <w:rPr>
-          <w:highlight w:val="cyan"/>
-        </w:rPr>
-        <w:t xml:space="preserve">Looking at </w:t>
-      </w:r>
-      <w:proofErr w:type="spellStart"/>
-      <w:r>
-        <w:rPr>
-          <w:highlight w:val="cyan"/>
-        </w:rPr>
-        <w:t>Blatta</w:t>
-      </w:r>
-      <w:proofErr w:type="spellEnd"/>
-      <w:r>
-        <w:rPr>
-          <w:highlight w:val="cyan"/>
-        </w:rPr>
-        <w:t xml:space="preserve"> raw reads similarity vs cockroach raw read similarity</w:t>
-      </w:r>
-    </w:p>
-    <w:p>
-      <w:pPr>
-        <w:rPr>
-          <w:highlight w:val="cyan"/>
-        </w:rPr>
-      </w:pPr>
-    </w:p>
-    <w:p>
-      <w:pPr>
-        <w:pStyle w:val="ListParagraph"/>
-        <w:numPr>
-          <w:ilvl w:val="0"/>
-          <w:numId w:val="2"/>
-        </w:numPr>
-      </w:pPr>
-      <w:proofErr w:type="spellStart"/>
-      <w:r>
-        <w:t>Jil</w:t>
-      </w:r>
-      <w:proofErr w:type="spellEnd"/>
-      <w:r>
-        <w:t xml:space="preserve"> and Oscar </w:t>
-      </w:r>
-      <w:r>
-        <w:t>– looking at distance distribution between inserts</w:t>
-      </w:r>
-    </w:p>
-    <w:p>
-      <w:pPr>
-        <w:pStyle w:val="ListParagraph"/>
-        <w:numPr>
-          <w:ilvl w:val="1"/>
-          <w:numId w:val="2"/>
-        </w:numPr>
-        <w:rPr>
-          <w:highlight w:val="green"/>
-        </w:rPr>
-      </w:pPr>
-      <w:r>
-        <w:rPr>
-          <w:highlight w:val="green"/>
-        </w:rPr>
-        <w:t>Finished</w:t>
-      </w:r>
-    </w:p>
-    <w:p>
-      <w:pPr>
-        <w:pStyle w:val="ListParagraph"/>
-        <w:numPr>
-          <w:ilvl w:val="1"/>
-          <w:numId w:val="2"/>
-        </w:numPr>
-        <w:rPr>
-          <w:highlight w:val="green"/>
-        </w:rPr>
-      </w:pPr>
-      <w:r>
-        <w:rPr>
-          <w:highlight w:val="green"/>
-        </w:rPr>
-        <w:t>Spreadsheet made with genomes/gaps</w:t>
-      </w:r>
-    </w:p>
-    <w:p>
-      <w:pPr>
-        <w:pStyle w:val="ListParagraph"/>
-        <w:numPr>
-          <w:ilvl w:val="1"/>
-          <w:numId w:val="2"/>
-        </w:numPr>
-        <w:rPr>
-          <w:highlight w:val="cyan"/>
-        </w:rPr>
-      </w:pPr>
-      <w:r>
-        <w:rPr>
-          <w:highlight w:val="cyan"/>
-        </w:rPr>
-        <w:t>Need to map distribution</w:t>
-      </w:r>
-      <w:r>
-        <w:rPr>
-          <w:highlight w:val="cyan"/>
-        </w:rPr>
-        <w:t xml:space="preserve"> – overall distribution (bell curve) and possibly alternative colouring for different contigs.</w:t>
-      </w:r>
-      <w:r>
-        <w:rPr>
-          <w:highlight w:val="cyan"/>
-        </w:rPr>
-        <w:t xml:space="preserve"> Is it random?</w:t>
-      </w:r>
-    </w:p>
-    <w:p>
-      <w:pPr>
-        <w:pStyle w:val="ListParagraph"/>
-        <w:numPr>
-          <w:ilvl w:val="1"/>
-          <w:numId w:val="2"/>
-        </w:numPr>
-        <w:rPr>
-          <w:highlight w:val="cyan"/>
-        </w:rPr>
-      </w:pPr>
-      <w:r>
-        <w:rPr>
-          <w:highlight w:val="cyan"/>
-        </w:rPr>
-        <w:t>Work on Figures (start with figure with counts of inserts</w:t>
-      </w:r>
-    </w:p>
-    <w:p>
-      <w:pPr>
-        <w:rPr>
-          <w:highlight w:val="cyan"/>
-        </w:rPr>
-      </w:pPr>
-    </w:p>
-    <w:p>
-      <w:pPr>
-        <w:pStyle w:val="ListParagraph"/>
-        <w:numPr>
-          <w:ilvl w:val="0"/>
-          <w:numId w:val="2"/>
-        </w:numPr>
-      </w:pPr>
-      <w:r>
-        <w:t>Maxim – annotating inserts</w:t>
-      </w:r>
-    </w:p>
-    <w:p>
-      <w:pPr>
-        <w:pStyle w:val="ListParagraph"/>
-        <w:numPr>
-          <w:ilvl w:val="1"/>
-          <w:numId w:val="2"/>
-        </w:numPr>
-        <w:rPr>
-          <w:highlight w:val="green"/>
-        </w:rPr>
-      </w:pPr>
-      <w:r>
-        <w:rPr>
-          <w:highlight w:val="green"/>
-        </w:rPr>
-        <w:t>Mostly intergenic, within genes it was mostly intronic</w:t>
-      </w:r>
-    </w:p>
-    <w:p>
-      <w:pPr>
-        <w:pStyle w:val="ListParagraph"/>
-        <w:numPr>
-          <w:ilvl w:val="2"/>
-          <w:numId w:val="2"/>
-        </w:numPr>
-        <w:rPr>
-          <w:highlight w:val="green"/>
-        </w:rPr>
-      </w:pPr>
-      <w:r>
-        <w:rPr>
-          <w:highlight w:val="green"/>
-        </w:rPr>
-        <w:t>With the caveat that we are using a coarse annotation method</w:t>
-      </w:r>
-    </w:p>
-    <w:p>
-      <w:pPr>
-        <w:pStyle w:val="ListParagraph"/>
-        <w:numPr>
-          <w:ilvl w:val="1"/>
-          <w:numId w:val="2"/>
-        </w:numPr>
-        <w:rPr>
-          <w:highlight w:val="cyan"/>
-        </w:rPr>
-      </w:pPr>
-      <w:r>
-        <w:rPr>
-          <w:highlight w:val="cyan"/>
-        </w:rPr>
-        <w:t>Compare this to proportion of features in genome</w:t>
-      </w:r>
-    </w:p>
-    <w:p>
-      <w:pPr>
-        <w:pStyle w:val="ListParagraph"/>
-        <w:numPr>
-          <w:ilvl w:val="1"/>
-          <w:numId w:val="2"/>
-        </w:numPr>
-        <w:rPr>
-          <w:highlight w:val="cyan"/>
-        </w:rPr>
-      </w:pPr>
-      <w:r>
-        <w:rPr>
-          <w:highlight w:val="cyan"/>
-        </w:rPr>
-        <w:t>Looking at some exons</w:t>
-      </w:r>
-    </w:p>
-    <w:p>
-      <w:pPr>
-        <w:rPr>
-          <w:highlight w:val="cyan"/>
-        </w:rPr>
-      </w:pPr>
-    </w:p>
-    <w:p>
-      <w:pPr>
-        <w:pStyle w:val="ListParagraph"/>
-        <w:numPr>
-          <w:ilvl w:val="0"/>
-          <w:numId w:val="2"/>
-        </w:numPr>
-      </w:pPr>
-      <w:r>
-        <w:t>Nate – PCRs</w:t>
-      </w:r>
-    </w:p>
-    <w:p>
-      <w:pPr>
-        <w:pStyle w:val="ListParagraph"/>
-        <w:numPr>
-          <w:ilvl w:val="1"/>
-          <w:numId w:val="2"/>
-        </w:numPr>
-        <w:rPr>
-          <w:highlight w:val="cyan"/>
-        </w:rPr>
-      </w:pPr>
-      <w:r>
-        <w:rPr>
-          <w:highlight w:val="cyan"/>
-        </w:rPr>
-        <w:t>Waiting on the ageing</w:t>
-      </w:r>
-    </w:p>
-    <w:p>
-      <w:pPr>
-        <w:rPr>
-          <w:highlight w:val="cyan"/>
-        </w:rPr>
-      </w:pPr>
-    </w:p>
-    <w:p>
-      <w:pPr>
-        <w:pStyle w:val="ListParagraph"/>
-        <w:numPr>
-          <w:ilvl w:val="0"/>
-          <w:numId w:val="2"/>
-        </w:numPr>
-      </w:pPr>
-      <w:r>
-        <w:t xml:space="preserve">Nate and Kyle </w:t>
-      </w:r>
-      <w:r>
-        <w:t>–</w:t>
-      </w:r>
-      <w:r>
-        <w:t xml:space="preserve"> manuscript</w:t>
-      </w:r>
-    </w:p>
-    <w:p>
-      <w:pPr>
-        <w:pStyle w:val="ListParagraph"/>
-        <w:numPr>
-          <w:ilvl w:val="1"/>
-          <w:numId w:val="2"/>
-        </w:numPr>
-        <w:rPr>
-          <w:highlight w:val="cyan"/>
-        </w:rPr>
-      </w:pPr>
-      <w:r>
-        <w:rPr>
-          <w:highlight w:val="cyan"/>
-        </w:rPr>
-        <w:t>Selling points:</w:t>
-      </w:r>
-    </w:p>
-    <w:p>
-      <w:pPr>
-        <w:pStyle w:val="ListParagraph"/>
-        <w:numPr>
-          <w:ilvl w:val="2"/>
-          <w:numId w:val="2"/>
-        </w:numPr>
-        <w:rPr>
-          <w:highlight w:val="cyan"/>
-        </w:rPr>
-      </w:pPr>
-      <w:r>
-        <w:rPr>
-          <w:highlight w:val="cyan"/>
-        </w:rPr>
-        <w:t>There are lots of them</w:t>
-      </w:r>
-    </w:p>
-    <w:p>
-      <w:pPr>
-        <w:pStyle w:val="ListParagraph"/>
-        <w:numPr>
-          <w:ilvl w:val="2"/>
-          <w:numId w:val="2"/>
-        </w:numPr>
-        <w:rPr>
-          <w:highlight w:val="cyan"/>
-        </w:rPr>
-      </w:pPr>
-      <w:r>
-        <w:rPr>
-          <w:highlight w:val="cyan"/>
-        </w:rPr>
-        <w:t>Many are very old</w:t>
-      </w:r>
-    </w:p>
-    <w:p>
-      <w:pPr>
-        <w:pStyle w:val="ListParagraph"/>
-        <w:numPr>
-          <w:ilvl w:val="2"/>
-          <w:numId w:val="2"/>
-        </w:numPr>
-        <w:rPr>
-          <w:highlight w:val="cyan"/>
-        </w:rPr>
-      </w:pPr>
-      <w:r>
-        <w:rPr>
-          <w:highlight w:val="cyan"/>
-        </w:rPr>
-        <w:t>Found in termites</w:t>
-      </w:r>
-    </w:p>
-    <w:p>
-      <w:pPr>
-        <w:pStyle w:val="ListParagraph"/>
-        <w:numPr>
-          <w:ilvl w:val="1"/>
-          <w:numId w:val="2"/>
-        </w:numPr>
-        <w:rPr>
-          <w:highlight w:val="cyan"/>
-        </w:rPr>
-      </w:pPr>
-      <w:r>
-        <w:rPr>
-          <w:highlight w:val="cyan"/>
-        </w:rPr>
-        <w:t>Figures:</w:t>
-      </w:r>
-    </w:p>
-    <w:p>
-      <w:pPr>
-        <w:pStyle w:val="ListParagraph"/>
-        <w:numPr>
-          <w:ilvl w:val="2"/>
-          <w:numId w:val="2"/>
-        </w:numPr>
-        <w:rPr>
-          <w:highlight w:val="cyan"/>
-        </w:rPr>
-      </w:pPr>
-      <w:r>
-        <w:rPr>
-          <w:highlight w:val="cyan"/>
-        </w:rPr>
-        <w:t>Counts of inserts for each genome</w:t>
-      </w:r>
-    </w:p>
-    <w:p>
-      <w:pPr>
-        <w:pStyle w:val="ListParagraph"/>
-        <w:numPr>
-          <w:ilvl w:val="3"/>
-          <w:numId w:val="2"/>
-        </w:numPr>
-        <w:rPr>
-          <w:highlight w:val="cyan"/>
-        </w:rPr>
-      </w:pPr>
-      <w:r>
-        <w:rPr>
-          <w:highlight w:val="cyan"/>
-        </w:rPr>
-        <w:t>within a tree</w:t>
-      </w:r>
-    </w:p>
-    <w:p>
-      <w:pPr>
-        <w:pStyle w:val="ListParagraph"/>
-        <w:numPr>
-          <w:ilvl w:val="3"/>
-          <w:numId w:val="2"/>
-        </w:numPr>
-        <w:rPr>
-          <w:highlight w:val="cyan"/>
-        </w:rPr>
-      </w:pPr>
-      <w:r>
-        <w:rPr>
-          <w:highlight w:val="cyan"/>
-        </w:rPr>
-        <w:t>add columns for tips</w:t>
-      </w:r>
-    </w:p>
-    <w:p>
-      <w:pPr>
-        <w:pStyle w:val="ListParagraph"/>
-        <w:numPr>
-          <w:ilvl w:val="3"/>
-          <w:numId w:val="2"/>
-        </w:numPr>
-        <w:rPr>
-          <w:highlight w:val="cyan"/>
-        </w:rPr>
-      </w:pPr>
-      <w:r>
-        <w:rPr>
-          <w:highlight w:val="cyan"/>
-        </w:rPr>
-        <w:lastRenderedPageBreak/>
-        <w:t>distance distribution</w:t>
-      </w:r>
-    </w:p>
-    <w:p>
-      <w:pPr>
-        <w:pStyle w:val="ListParagraph"/>
-        <w:numPr>
-          <w:ilvl w:val="2"/>
-          <w:numId w:val="2"/>
-        </w:numPr>
-        <w:rPr>
-          <w:highlight w:val="cyan"/>
-        </w:rPr>
-      </w:pPr>
-      <w:r>
-        <w:rPr>
-          <w:highlight w:val="cyan"/>
-        </w:rPr>
-        <w:t>Annotation results</w:t>
-      </w:r>
-    </w:p>
-    <w:p>
-      <w:pPr>
-        <w:pStyle w:val="ListParagraph"/>
-        <w:numPr>
-          <w:ilvl w:val="3"/>
-          <w:numId w:val="2"/>
-        </w:numPr>
-        <w:rPr>
-          <w:highlight w:val="cyan"/>
-        </w:rPr>
-      </w:pPr>
-      <w:r>
-        <w:rPr>
-          <w:highlight w:val="cyan"/>
-        </w:rPr>
-        <w:t>e.g. pie graph of proportion of inserts in each genome vs expected (based % of total features)</w:t>
-      </w:r>
-    </w:p>
-    <w:p>
-      <w:pPr>
-        <w:pStyle w:val="ListParagraph"/>
-        <w:numPr>
-          <w:ilvl w:val="2"/>
-          <w:numId w:val="2"/>
-        </w:numPr>
-        <w:rPr>
-          <w:highlight w:val="cyan"/>
-        </w:rPr>
-      </w:pPr>
-      <w:r>
-        <w:rPr>
-          <w:highlight w:val="cyan"/>
-        </w:rPr>
-        <w:t>Ageing:</w:t>
-      </w:r>
-    </w:p>
-    <w:p>
-      <w:pPr>
-        <w:pStyle w:val="ListParagraph"/>
-        <w:numPr>
-          <w:ilvl w:val="3"/>
-          <w:numId w:val="2"/>
-        </w:numPr>
-        <w:rPr>
-          <w:highlight w:val="cyan"/>
-        </w:rPr>
-      </w:pPr>
-      <w:r>
-        <w:rPr>
-          <w:highlight w:val="cyan"/>
-        </w:rPr>
-        <w:t>Number of ancestral vs recent</w:t>
-      </w:r>
-    </w:p>
-    <w:p>
-      <w:pPr>
-        <w:pStyle w:val="ListParagraph"/>
-        <w:numPr>
-          <w:ilvl w:val="3"/>
-          <w:numId w:val="2"/>
-        </w:numPr>
-        <w:rPr>
-          <w:highlight w:val="cyan"/>
-        </w:rPr>
-      </w:pPr>
-      <w:r>
-        <w:rPr>
-          <w:highlight w:val="cyan"/>
-        </w:rPr>
-        <w:t>Of the ancestral, minimum ages</w:t>
-      </w:r>
-    </w:p>
-    <w:p>
-      <w:pPr>
-        <w:pStyle w:val="ListParagraph"/>
-        <w:numPr>
-          <w:ilvl w:val="2"/>
-          <w:numId w:val="2"/>
-        </w:numPr>
-        <w:rPr>
-          <w:highlight w:val="cyan"/>
-        </w:rPr>
-      </w:pPr>
-      <w:r>
-        <w:rPr>
-          <w:highlight w:val="cyan"/>
-        </w:rPr>
-        <w:t>Picture of alignment of raw read over insert</w:t>
-      </w:r>
-    </w:p>
-    <w:p/>
-    <w:p>
-      <w:pPr>
-        <w:pStyle w:val="ListParagraph"/>
-        <w:numPr>
-          <w:ilvl w:val="0"/>
-          <w:numId w:val="2"/>
-        </w:numPr>
-      </w:pPr>
-      <w:r>
-        <w:t>Other things to consider:</w:t>
-      </w:r>
-    </w:p>
-    <w:p>
-      <w:pPr>
-        <w:pStyle w:val="ListParagraph"/>
-        <w:numPr>
-          <w:ilvl w:val="1"/>
-          <w:numId w:val="2"/>
-        </w:numPr>
-      </w:pPr>
-      <w:r>
-        <w:t>look at insert lengths for ancestral vs recent</w:t>
-      </w:r>
-    </w:p>
-    <w:p>
-      <w:pPr>
-        <w:pStyle w:val="ListParagraph"/>
-        <w:numPr>
-          <w:ilvl w:val="1"/>
-          <w:numId w:val="2"/>
-        </w:numPr>
-      </w:pPr>
-      <w:r>
-        <w:t>alternative thresholds and repeating pipeline</w:t>
-      </w:r>
-    </w:p>
-    <w:p>
-      <w:pPr>
-        <w:pStyle w:val="ListParagraph"/>
-        <w:numPr>
-          <w:ilvl w:val="1"/>
-          <w:numId w:val="2"/>
-        </w:numPr>
-      </w:pPr>
-      <w:r>
-        <w:t xml:space="preserve">Looking at inserts with </w:t>
-      </w:r>
-      <w:proofErr w:type="spellStart"/>
-      <w:r>
-        <w:t>RNAseq</w:t>
-      </w:r>
-      <w:proofErr w:type="spellEnd"/>
-      <w:r>
-        <w:t xml:space="preserve"> data (we have this for at least 2 species</w:t>
-      </w:r>
-    </w:p>
-    <w:p>
-      <w:pPr>
-        <w:pStyle w:val="ListParagraph"/>
-        <w:numPr>
-          <w:ilvl w:val="1"/>
-          <w:numId w:val="2"/>
-        </w:numPr>
-      </w:pPr>
-      <w:r>
-        <w:t>SNP distribution – are the flanking regions conserved?</w:t>
-      </w:r>
-    </w:p>
-    <w:p>
-      <w:pPr>
-        <w:pStyle w:val="ListParagraph"/>
-        <w:numPr>
-          <w:ilvl w:val="1"/>
-          <w:numId w:val="2"/>
-        </w:numPr>
-      </w:pPr>
-      <w:r>
-        <w:t>looking at distance from transposons and distance from repeat regions</w:t>
-      </w:r>
-    </w:p>
-    <w:p>
-      <w:pPr>
-        <w:pStyle w:val="ListParagraph"/>
-        <w:numPr>
-          <w:ilvl w:val="1"/>
-          <w:numId w:val="2"/>
-        </w:numPr>
-      </w:pPr>
-      <w:r>
-        <w:t>GC content of inserts (e.g. regulatory regions)</w:t>
-      </w:r>
-    </w:p>
-    <w:p>
-      <w:pPr>
-        <w:pStyle w:val="ListParagraph"/>
-        <w:numPr>
-          <w:ilvl w:val="1"/>
-          <w:numId w:val="2"/>
-        </w:numPr>
-      </w:pPr>
-      <w:r>
-        <w:t xml:space="preserve">what parts of the </w:t>
-      </w:r>
-      <w:proofErr w:type="spellStart"/>
-      <w:r>
-        <w:t>Blattabacterium</w:t>
-      </w:r>
-      <w:proofErr w:type="spellEnd"/>
-      <w:r>
-        <w:t xml:space="preserve"> genome are getting inserting – is it random</w:t>
-      </w:r>
-    </w:p>
-    <w:p/>
-    <w:p/>
+      <w:proofErr w:type="gramEnd"/>
+    </w:p>
     <w:sectPr>
       <w:pgSz w:w="11900" w:h="16840"/>
       <w:pgMar w:top="1440" w:right="1440" w:bottom="1440" w:left="1440" w:header="708" w:footer="708" w:gutter="0"/>
@@ -1059,6 +1255,345 @@
 <file path=word/numbering.xml><?xml version="1.0" encoding="utf-8"?>
 <w:numbering xmlns:wpc="http://schemas.microsoft.com/office/word/2010/wordprocessingCanvas" xmlns:cx="http://schemas.microsoft.com/office/drawing/2014/chartex" xmlns:cx1="http://schemas.microsoft.com/office/drawing/2015/9/8/chartex" xmlns:cx2="http://schemas.microsoft.com/office/drawing/2015/10/21/chartex" xmlns:cx3="http://schemas.microsoft.com/office/drawing/2016/5/9/chartex" xmlns:cx4="http://schemas.microsoft.com/office/drawing/2016/5/10/chartex" xmlns:cx5="http://schemas.microsoft.com/office/drawing/2016/5/11/chartex" xmlns:cx6="http://schemas.microsoft.com/office/drawing/2016/5/12/chartex" xmlns:cx7="http://schemas.microsoft.com/office/drawing/2016/5/13/chartex" xmlns:cx8="http://schemas.microsoft.com/office/drawing/2016/5/14/chartex" xmlns:mc="http://schemas.openxmlformats.org/markup-compatibility/2006" xmlns:aink="http://schemas.microsoft.com/office/drawing/2016/ink" xmlns:am3d="http://schemas.microsoft.com/office/drawing/2017/model3d" xmlns:o="urn:schemas-microsoft-com:office:office" xmlns:r="http://schemas.openxmlformats.org/officeDocument/2006/relationships" xmlns:m="http://schemas.openxmlformats.org/officeDocument/2006/math" xmlns:v="urn:schemas-microsoft-com:vml" xmlns:wp14="http://schemas.microsoft.com/office/word/2010/wordprocessingDrawing" xmlns:wp="http://schemas.openxmlformats.org/drawingml/2006/wordprocessingDrawing" xmlns:w10="urn:schemas-microsoft-com:office:word" xmlns:w="http://schemas.openxmlformats.org/wordprocessingml/2006/main" xmlns:w14="http://schemas.microsoft.com/office/word/2010/wordml" xmlns:w15="http://schemas.microsoft.com/office/word/2012/wordml" xmlns:w16cid="http://schemas.microsoft.com/office/word/2016/wordml/cid" xmlns:w16se="http://schemas.microsoft.com/office/word/2015/wordml/symex" xmlns:wpg="http://schemas.microsoft.com/office/word/2010/wordprocessingGroup" xmlns:wpi="http://schemas.microsoft.com/office/word/2010/wordprocessingInk" xmlns:wne="http://schemas.microsoft.com/office/word/2006/wordml" xmlns:wps="http://schemas.microsoft.com/office/word/2010/wordprocessingShape" mc:Ignorable="w14 w15 w16se w16cid wp14">
   <w:abstractNum w:abstractNumId="0" w15:restartNumberingAfterBreak="0">
+    <w:nsid w:val="0BF02868"/>
+    <w:multiLevelType w:val="hybridMultilevel"/>
+    <w:tmpl w:val="CB2C0620"/>
+    <w:lvl w:ilvl="0" w:tplc="446C3D38">
+      <w:start w:val="16"/>
+      <w:numFmt w:val="bullet"/>
+      <w:lvlText w:val="-"/>
+      <w:lvlJc w:val="left"/>
+      <w:pPr>
+        <w:ind w:left="720" w:hanging="360"/>
+      </w:pPr>
+      <w:rPr>
+        <w:rFonts w:ascii="Calibri" w:eastAsiaTheme="minorEastAsia" w:hAnsi="Calibri" w:cs="Calibri" w:hint="default"/>
+      </w:rPr>
+    </w:lvl>
+    <w:lvl w:ilvl="1" w:tplc="04090003" w:tentative="1">
+      <w:start w:val="1"/>
+      <w:numFmt w:val="bullet"/>
+      <w:lvlText w:val="o"/>
+      <w:lvlJc w:val="left"/>
+      <w:pPr>
+        <w:ind w:left="1440" w:hanging="360"/>
+      </w:pPr>
+      <w:rPr>
+        <w:rFonts w:ascii="Courier New" w:hAnsi="Courier New" w:cs="Courier New" w:hint="default"/>
+      </w:rPr>
+    </w:lvl>
+    <w:lvl w:ilvl="2" w:tplc="04090005" w:tentative="1">
+      <w:start w:val="1"/>
+      <w:numFmt w:val="bullet"/>
+      <w:lvlText w:val=""/>
+      <w:lvlJc w:val="left"/>
+      <w:pPr>
+        <w:ind w:left="2160" w:hanging="360"/>
+      </w:pPr>
+      <w:rPr>
+        <w:rFonts w:ascii="Wingdings" w:hAnsi="Wingdings" w:hint="default"/>
+      </w:rPr>
+    </w:lvl>
+    <w:lvl w:ilvl="3" w:tplc="04090001" w:tentative="1">
+      <w:start w:val="1"/>
+      <w:numFmt w:val="bullet"/>
+      <w:lvlText w:val=""/>
+      <w:lvlJc w:val="left"/>
+      <w:pPr>
+        <w:ind w:left="2880" w:hanging="360"/>
+      </w:pPr>
+      <w:rPr>
+        <w:rFonts w:ascii="Symbol" w:hAnsi="Symbol" w:hint="default"/>
+      </w:rPr>
+    </w:lvl>
+    <w:lvl w:ilvl="4" w:tplc="04090003" w:tentative="1">
+      <w:start w:val="1"/>
+      <w:numFmt w:val="bullet"/>
+      <w:lvlText w:val="o"/>
+      <w:lvlJc w:val="left"/>
+      <w:pPr>
+        <w:ind w:left="3600" w:hanging="360"/>
+      </w:pPr>
+      <w:rPr>
+        <w:rFonts w:ascii="Courier New" w:hAnsi="Courier New" w:cs="Courier New" w:hint="default"/>
+      </w:rPr>
+    </w:lvl>
+    <w:lvl w:ilvl="5" w:tplc="04090005" w:tentative="1">
+      <w:start w:val="1"/>
+      <w:numFmt w:val="bullet"/>
+      <w:lvlText w:val=""/>
+      <w:lvlJc w:val="left"/>
+      <w:pPr>
+        <w:ind w:left="4320" w:hanging="360"/>
+      </w:pPr>
+      <w:rPr>
+        <w:rFonts w:ascii="Wingdings" w:hAnsi="Wingdings" w:hint="default"/>
+      </w:rPr>
+    </w:lvl>
+    <w:lvl w:ilvl="6" w:tplc="04090001" w:tentative="1">
+      <w:start w:val="1"/>
+      <w:numFmt w:val="bullet"/>
+      <w:lvlText w:val=""/>
+      <w:lvlJc w:val="left"/>
+      <w:pPr>
+        <w:ind w:left="5040" w:hanging="360"/>
+      </w:pPr>
+      <w:rPr>
+        <w:rFonts w:ascii="Symbol" w:hAnsi="Symbol" w:hint="default"/>
+      </w:rPr>
+    </w:lvl>
+    <w:lvl w:ilvl="7" w:tplc="04090003" w:tentative="1">
+      <w:start w:val="1"/>
+      <w:numFmt w:val="bullet"/>
+      <w:lvlText w:val="o"/>
+      <w:lvlJc w:val="left"/>
+      <w:pPr>
+        <w:ind w:left="5760" w:hanging="360"/>
+      </w:pPr>
+      <w:rPr>
+        <w:rFonts w:ascii="Courier New" w:hAnsi="Courier New" w:cs="Courier New" w:hint="default"/>
+      </w:rPr>
+    </w:lvl>
+    <w:lvl w:ilvl="8" w:tplc="04090005" w:tentative="1">
+      <w:start w:val="1"/>
+      <w:numFmt w:val="bullet"/>
+      <w:lvlText w:val=""/>
+      <w:lvlJc w:val="left"/>
+      <w:pPr>
+        <w:ind w:left="6480" w:hanging="360"/>
+      </w:pPr>
+      <w:rPr>
+        <w:rFonts w:ascii="Wingdings" w:hAnsi="Wingdings" w:hint="default"/>
+      </w:rPr>
+    </w:lvl>
+  </w:abstractNum>
+  <w:abstractNum w:abstractNumId="1" w15:restartNumberingAfterBreak="0">
+    <w:nsid w:val="17C92C88"/>
+    <w:multiLevelType w:val="hybridMultilevel"/>
+    <w:tmpl w:val="02C48856"/>
+    <w:lvl w:ilvl="0" w:tplc="446C3D38">
+      <w:start w:val="16"/>
+      <w:numFmt w:val="bullet"/>
+      <w:lvlText w:val="-"/>
+      <w:lvlJc w:val="left"/>
+      <w:pPr>
+        <w:ind w:left="720" w:hanging="360"/>
+      </w:pPr>
+      <w:rPr>
+        <w:rFonts w:ascii="Calibri" w:eastAsiaTheme="minorEastAsia" w:hAnsi="Calibri" w:cs="Calibri" w:hint="default"/>
+      </w:rPr>
+    </w:lvl>
+    <w:lvl w:ilvl="1" w:tplc="04090003" w:tentative="1">
+      <w:start w:val="1"/>
+      <w:numFmt w:val="bullet"/>
+      <w:lvlText w:val="o"/>
+      <w:lvlJc w:val="left"/>
+      <w:pPr>
+        <w:ind w:left="1440" w:hanging="360"/>
+      </w:pPr>
+      <w:rPr>
+        <w:rFonts w:ascii="Courier New" w:hAnsi="Courier New" w:cs="Courier New" w:hint="default"/>
+      </w:rPr>
+    </w:lvl>
+    <w:lvl w:ilvl="2" w:tplc="04090005" w:tentative="1">
+      <w:start w:val="1"/>
+      <w:numFmt w:val="bullet"/>
+      <w:lvlText w:val=""/>
+      <w:lvlJc w:val="left"/>
+      <w:pPr>
+        <w:ind w:left="2160" w:hanging="360"/>
+      </w:pPr>
+      <w:rPr>
+        <w:rFonts w:ascii="Wingdings" w:hAnsi="Wingdings" w:hint="default"/>
+      </w:rPr>
+    </w:lvl>
+    <w:lvl w:ilvl="3" w:tplc="04090001" w:tentative="1">
+      <w:start w:val="1"/>
+      <w:numFmt w:val="bullet"/>
+      <w:lvlText w:val=""/>
+      <w:lvlJc w:val="left"/>
+      <w:pPr>
+        <w:ind w:left="2880" w:hanging="360"/>
+      </w:pPr>
+      <w:rPr>
+        <w:rFonts w:ascii="Symbol" w:hAnsi="Symbol" w:hint="default"/>
+      </w:rPr>
+    </w:lvl>
+    <w:lvl w:ilvl="4" w:tplc="04090003" w:tentative="1">
+      <w:start w:val="1"/>
+      <w:numFmt w:val="bullet"/>
+      <w:lvlText w:val="o"/>
+      <w:lvlJc w:val="left"/>
+      <w:pPr>
+        <w:ind w:left="3600" w:hanging="360"/>
+      </w:pPr>
+      <w:rPr>
+        <w:rFonts w:ascii="Courier New" w:hAnsi="Courier New" w:cs="Courier New" w:hint="default"/>
+      </w:rPr>
+    </w:lvl>
+    <w:lvl w:ilvl="5" w:tplc="04090005" w:tentative="1">
+      <w:start w:val="1"/>
+      <w:numFmt w:val="bullet"/>
+      <w:lvlText w:val=""/>
+      <w:lvlJc w:val="left"/>
+      <w:pPr>
+        <w:ind w:left="4320" w:hanging="360"/>
+      </w:pPr>
+      <w:rPr>
+        <w:rFonts w:ascii="Wingdings" w:hAnsi="Wingdings" w:hint="default"/>
+      </w:rPr>
+    </w:lvl>
+    <w:lvl w:ilvl="6" w:tplc="04090001" w:tentative="1">
+      <w:start w:val="1"/>
+      <w:numFmt w:val="bullet"/>
+      <w:lvlText w:val=""/>
+      <w:lvlJc w:val="left"/>
+      <w:pPr>
+        <w:ind w:left="5040" w:hanging="360"/>
+      </w:pPr>
+      <w:rPr>
+        <w:rFonts w:ascii="Symbol" w:hAnsi="Symbol" w:hint="default"/>
+      </w:rPr>
+    </w:lvl>
+    <w:lvl w:ilvl="7" w:tplc="04090003" w:tentative="1">
+      <w:start w:val="1"/>
+      <w:numFmt w:val="bullet"/>
+      <w:lvlText w:val="o"/>
+      <w:lvlJc w:val="left"/>
+      <w:pPr>
+        <w:ind w:left="5760" w:hanging="360"/>
+      </w:pPr>
+      <w:rPr>
+        <w:rFonts w:ascii="Courier New" w:hAnsi="Courier New" w:cs="Courier New" w:hint="default"/>
+      </w:rPr>
+    </w:lvl>
+    <w:lvl w:ilvl="8" w:tplc="04090005" w:tentative="1">
+      <w:start w:val="1"/>
+      <w:numFmt w:val="bullet"/>
+      <w:lvlText w:val=""/>
+      <w:lvlJc w:val="left"/>
+      <w:pPr>
+        <w:ind w:left="6480" w:hanging="360"/>
+      </w:pPr>
+      <w:rPr>
+        <w:rFonts w:ascii="Wingdings" w:hAnsi="Wingdings" w:hint="default"/>
+      </w:rPr>
+    </w:lvl>
+  </w:abstractNum>
+  <w:abstractNum w:abstractNumId="2" w15:restartNumberingAfterBreak="0">
+    <w:nsid w:val="1BAB38A3"/>
+    <w:multiLevelType w:val="hybridMultilevel"/>
+    <w:tmpl w:val="55762140"/>
+    <w:lvl w:ilvl="0" w:tplc="446C3D38">
+      <w:start w:val="16"/>
+      <w:numFmt w:val="bullet"/>
+      <w:lvlText w:val="-"/>
+      <w:lvlJc w:val="left"/>
+      <w:pPr>
+        <w:ind w:left="720" w:hanging="360"/>
+      </w:pPr>
+      <w:rPr>
+        <w:rFonts w:ascii="Calibri" w:eastAsiaTheme="minorEastAsia" w:hAnsi="Calibri" w:cs="Calibri" w:hint="default"/>
+      </w:rPr>
+    </w:lvl>
+    <w:lvl w:ilvl="1" w:tplc="04090003" w:tentative="1">
+      <w:start w:val="1"/>
+      <w:numFmt w:val="bullet"/>
+      <w:lvlText w:val="o"/>
+      <w:lvlJc w:val="left"/>
+      <w:pPr>
+        <w:ind w:left="1440" w:hanging="360"/>
+      </w:pPr>
+      <w:rPr>
+        <w:rFonts w:ascii="Courier New" w:hAnsi="Courier New" w:cs="Courier New" w:hint="default"/>
+      </w:rPr>
+    </w:lvl>
+    <w:lvl w:ilvl="2" w:tplc="04090005" w:tentative="1">
+      <w:start w:val="1"/>
+      <w:numFmt w:val="bullet"/>
+      <w:lvlText w:val=""/>
+      <w:lvlJc w:val="left"/>
+      <w:pPr>
+        <w:ind w:left="2160" w:hanging="360"/>
+      </w:pPr>
+      <w:rPr>
+        <w:rFonts w:ascii="Wingdings" w:hAnsi="Wingdings" w:hint="default"/>
+      </w:rPr>
+    </w:lvl>
+    <w:lvl w:ilvl="3" w:tplc="04090001" w:tentative="1">
+      <w:start w:val="1"/>
+      <w:numFmt w:val="bullet"/>
+      <w:lvlText w:val=""/>
+      <w:lvlJc w:val="left"/>
+      <w:pPr>
+        <w:ind w:left="2880" w:hanging="360"/>
+      </w:pPr>
+      <w:rPr>
+        <w:rFonts w:ascii="Symbol" w:hAnsi="Symbol" w:hint="default"/>
+      </w:rPr>
+    </w:lvl>
+    <w:lvl w:ilvl="4" w:tplc="04090003" w:tentative="1">
+      <w:start w:val="1"/>
+      <w:numFmt w:val="bullet"/>
+      <w:lvlText w:val="o"/>
+      <w:lvlJc w:val="left"/>
+      <w:pPr>
+        <w:ind w:left="3600" w:hanging="360"/>
+      </w:pPr>
+      <w:rPr>
+        <w:rFonts w:ascii="Courier New" w:hAnsi="Courier New" w:cs="Courier New" w:hint="default"/>
+      </w:rPr>
+    </w:lvl>
+    <w:lvl w:ilvl="5" w:tplc="04090005" w:tentative="1">
+      <w:start w:val="1"/>
+      <w:numFmt w:val="bullet"/>
+      <w:lvlText w:val=""/>
+      <w:lvlJc w:val="left"/>
+      <w:pPr>
+        <w:ind w:left="4320" w:hanging="360"/>
+      </w:pPr>
+      <w:rPr>
+        <w:rFonts w:ascii="Wingdings" w:hAnsi="Wingdings" w:hint="default"/>
+      </w:rPr>
+    </w:lvl>
+    <w:lvl w:ilvl="6" w:tplc="04090001" w:tentative="1">
+      <w:start w:val="1"/>
+      <w:numFmt w:val="bullet"/>
+      <w:lvlText w:val=""/>
+      <w:lvlJc w:val="left"/>
+      <w:pPr>
+        <w:ind w:left="5040" w:hanging="360"/>
+      </w:pPr>
+      <w:rPr>
+        <w:rFonts w:ascii="Symbol" w:hAnsi="Symbol" w:hint="default"/>
+      </w:rPr>
+    </w:lvl>
+    <w:lvl w:ilvl="7" w:tplc="04090003" w:tentative="1">
+      <w:start w:val="1"/>
+      <w:numFmt w:val="bullet"/>
+      <w:lvlText w:val="o"/>
+      <w:lvlJc w:val="left"/>
+      <w:pPr>
+        <w:ind w:left="5760" w:hanging="360"/>
+      </w:pPr>
+      <w:rPr>
+        <w:rFonts w:ascii="Courier New" w:hAnsi="Courier New" w:cs="Courier New" w:hint="default"/>
+      </w:rPr>
+    </w:lvl>
+    <w:lvl w:ilvl="8" w:tplc="04090005" w:tentative="1">
+      <w:start w:val="1"/>
+      <w:numFmt w:val="bullet"/>
+      <w:lvlText w:val=""/>
+      <w:lvlJc w:val="left"/>
+      <w:pPr>
+        <w:ind w:left="6480" w:hanging="360"/>
+      </w:pPr>
+      <w:rPr>
+        <w:rFonts w:ascii="Wingdings" w:hAnsi="Wingdings" w:hint="default"/>
+      </w:rPr>
+    </w:lvl>
+  </w:abstractNum>
+  <w:abstractNum w:abstractNumId="3" w15:restartNumberingAfterBreak="0">
     <w:nsid w:val="23CE3F06"/>
     <w:multiLevelType w:val="hybridMultilevel"/>
     <w:tmpl w:val="0584D754"/>
@@ -1171,7 +1706,7 @@
       </w:rPr>
     </w:lvl>
   </w:abstractNum>
-  <w:abstractNum w:abstractNumId="1" w15:restartNumberingAfterBreak="0">
+  <w:abstractNum w:abstractNumId="4" w15:restartNumberingAfterBreak="0">
     <w:nsid w:val="245F154F"/>
     <w:multiLevelType w:val="hybridMultilevel"/>
     <w:tmpl w:val="262E140C"/>
@@ -1283,7 +1818,7 @@
       </w:rPr>
     </w:lvl>
   </w:abstractNum>
-  <w:abstractNum w:abstractNumId="2" w15:restartNumberingAfterBreak="0">
+  <w:abstractNum w:abstractNumId="5" w15:restartNumberingAfterBreak="0">
     <w:nsid w:val="3FC35D28"/>
     <w:multiLevelType w:val="hybridMultilevel"/>
     <w:tmpl w:val="3BD01162"/>
@@ -1396,7 +1931,120 @@
       </w:rPr>
     </w:lvl>
   </w:abstractNum>
-  <w:abstractNum w:abstractNumId="3" w15:restartNumberingAfterBreak="0">
+  <w:abstractNum w:abstractNumId="6" w15:restartNumberingAfterBreak="0">
+    <w:nsid w:val="542311C3"/>
+    <w:multiLevelType w:val="hybridMultilevel"/>
+    <w:tmpl w:val="70920186"/>
+    <w:lvl w:ilvl="0" w:tplc="446C3D38">
+      <w:start w:val="16"/>
+      <w:numFmt w:val="bullet"/>
+      <w:lvlText w:val="-"/>
+      <w:lvlJc w:val="left"/>
+      <w:pPr>
+        <w:ind w:left="720" w:hanging="360"/>
+      </w:pPr>
+      <w:rPr>
+        <w:rFonts w:ascii="Calibri" w:eastAsiaTheme="minorEastAsia" w:hAnsi="Calibri" w:cs="Calibri" w:hint="default"/>
+      </w:rPr>
+    </w:lvl>
+    <w:lvl w:ilvl="1" w:tplc="04090003" w:tentative="1">
+      <w:start w:val="1"/>
+      <w:numFmt w:val="bullet"/>
+      <w:lvlText w:val="o"/>
+      <w:lvlJc w:val="left"/>
+      <w:pPr>
+        <w:ind w:left="1440" w:hanging="360"/>
+      </w:pPr>
+      <w:rPr>
+        <w:rFonts w:ascii="Courier New" w:hAnsi="Courier New" w:cs="Courier New" w:hint="default"/>
+      </w:rPr>
+    </w:lvl>
+    <w:lvl w:ilvl="2" w:tplc="04090005" w:tentative="1">
+      <w:start w:val="1"/>
+      <w:numFmt w:val="bullet"/>
+      <w:lvlText w:val=""/>
+      <w:lvlJc w:val="left"/>
+      <w:pPr>
+        <w:ind w:left="2160" w:hanging="360"/>
+      </w:pPr>
+      <w:rPr>
+        <w:rFonts w:ascii="Wingdings" w:hAnsi="Wingdings" w:hint="default"/>
+      </w:rPr>
+    </w:lvl>
+    <w:lvl w:ilvl="3" w:tplc="04090001" w:tentative="1">
+      <w:start w:val="1"/>
+      <w:numFmt w:val="bullet"/>
+      <w:lvlText w:val=""/>
+      <w:lvlJc w:val="left"/>
+      <w:pPr>
+        <w:ind w:left="2880" w:hanging="360"/>
+      </w:pPr>
+      <w:rPr>
+        <w:rFonts w:ascii="Symbol" w:hAnsi="Symbol" w:hint="default"/>
+      </w:rPr>
+    </w:lvl>
+    <w:lvl w:ilvl="4" w:tplc="04090003" w:tentative="1">
+      <w:start w:val="1"/>
+      <w:numFmt w:val="bullet"/>
+      <w:lvlText w:val="o"/>
+      <w:lvlJc w:val="left"/>
+      <w:pPr>
+        <w:ind w:left="3600" w:hanging="360"/>
+      </w:pPr>
+      <w:rPr>
+        <w:rFonts w:ascii="Courier New" w:hAnsi="Courier New" w:cs="Courier New" w:hint="default"/>
+      </w:rPr>
+    </w:lvl>
+    <w:lvl w:ilvl="5" w:tplc="04090005" w:tentative="1">
+      <w:start w:val="1"/>
+      <w:numFmt w:val="bullet"/>
+      <w:lvlText w:val=""/>
+      <w:lvlJc w:val="left"/>
+      <w:pPr>
+        <w:ind w:left="4320" w:hanging="360"/>
+      </w:pPr>
+      <w:rPr>
+        <w:rFonts w:ascii="Wingdings" w:hAnsi="Wingdings" w:hint="default"/>
+      </w:rPr>
+    </w:lvl>
+    <w:lvl w:ilvl="6" w:tplc="04090001" w:tentative="1">
+      <w:start w:val="1"/>
+      <w:numFmt w:val="bullet"/>
+      <w:lvlText w:val=""/>
+      <w:lvlJc w:val="left"/>
+      <w:pPr>
+        <w:ind w:left="5040" w:hanging="360"/>
+      </w:pPr>
+      <w:rPr>
+        <w:rFonts w:ascii="Symbol" w:hAnsi="Symbol" w:hint="default"/>
+      </w:rPr>
+    </w:lvl>
+    <w:lvl w:ilvl="7" w:tplc="04090003" w:tentative="1">
+      <w:start w:val="1"/>
+      <w:numFmt w:val="bullet"/>
+      <w:lvlText w:val="o"/>
+      <w:lvlJc w:val="left"/>
+      <w:pPr>
+        <w:ind w:left="5760" w:hanging="360"/>
+      </w:pPr>
+      <w:rPr>
+        <w:rFonts w:ascii="Courier New" w:hAnsi="Courier New" w:cs="Courier New" w:hint="default"/>
+      </w:rPr>
+    </w:lvl>
+    <w:lvl w:ilvl="8" w:tplc="04090005" w:tentative="1">
+      <w:start w:val="1"/>
+      <w:numFmt w:val="bullet"/>
+      <w:lvlText w:val=""/>
+      <w:lvlJc w:val="left"/>
+      <w:pPr>
+        <w:ind w:left="6480" w:hanging="360"/>
+      </w:pPr>
+      <w:rPr>
+        <w:rFonts w:ascii="Wingdings" w:hAnsi="Wingdings" w:hint="default"/>
+      </w:rPr>
+    </w:lvl>
+  </w:abstractNum>
+  <w:abstractNum w:abstractNumId="7" w15:restartNumberingAfterBreak="0">
     <w:nsid w:val="54D11D18"/>
     <w:multiLevelType w:val="hybridMultilevel"/>
     <w:tmpl w:val="B9C41916"/>
@@ -1510,16 +2158,28 @@
     </w:lvl>
   </w:abstractNum>
   <w:num w:numId="1">
+    <w:abstractNumId w:val="7"/>
+  </w:num>
+  <w:num w:numId="2">
     <w:abstractNumId w:val="3"/>
   </w:num>
-  <w:num w:numId="2">
+  <w:num w:numId="3">
+    <w:abstractNumId w:val="4"/>
+  </w:num>
+  <w:num w:numId="4">
+    <w:abstractNumId w:val="5"/>
+  </w:num>
+  <w:num w:numId="5">
+    <w:abstractNumId w:val="2"/>
+  </w:num>
+  <w:num w:numId="6">
+    <w:abstractNumId w:val="6"/>
+  </w:num>
+  <w:num w:numId="7">
     <w:abstractNumId w:val="0"/>
   </w:num>
-  <w:num w:numId="3">
+  <w:num w:numId="8">
     <w:abstractNumId w:val="1"/>
-  </w:num>
-  <w:num w:numId="4">
-    <w:abstractNumId w:val="2"/>
   </w:num>
 </w:numbering>
 </file>

</xml_diff>

<commit_message>
Updated project management document
</commit_message>
<xml_diff>
--- a/HGT-project-management.docx
+++ b/HGT-project-management.docx
@@ -1238,9 +1238,50 @@
       <w:r>
         <w:t>= ?</w:t>
       </w:r>
+      <w:proofErr w:type="gramEnd"/>
+    </w:p>
+    <w:p/>
+    <w:p>
+      <w:r>
+        <w:t xml:space="preserve">Methylation </w:t>
+      </w:r>
+      <w:proofErr w:type="gramStart"/>
+      <w:r>
+        <w:t>= ?</w:t>
+      </w:r>
+      <w:proofErr w:type="gramEnd"/>
+    </w:p>
+    <w:p>
+      <w:pPr>
+        <w:pStyle w:val="ListParagraph"/>
+        <w:numPr>
+          <w:ilvl w:val="0"/>
+          <w:numId w:val="5"/>
+        </w:numPr>
+      </w:pPr>
+      <w:r>
+        <w:t>M</w:t>
+      </w:r>
+      <w:r>
+        <w:t>ethylation vs the flanking region</w:t>
+      </w:r>
+    </w:p>
+    <w:p>
+      <w:pPr>
+        <w:pStyle w:val="ListParagraph"/>
+        <w:numPr>
+          <w:ilvl w:val="0"/>
+          <w:numId w:val="5"/>
+        </w:numPr>
+      </w:pPr>
+      <w:r>
+        <w:t>Only possibl</w:t>
+      </w:r>
+      <w:r>
+        <w:t>e for species with pod5 files</w:t>
+      </w:r>
       <w:bookmarkStart w:id="0" w:name="_GoBack"/>
       <w:bookmarkEnd w:id="0"/>
-      <w:proofErr w:type="gramEnd"/>
     </w:p>
     <w:sectPr>
       <w:pgSz w:w="11900" w:h="16840"/>

</xml_diff>